<commit_message>
Done GameCenter and fix use case diagrams
</commit_message>
<xml_diff>
--- a/Diagrams/FindAllActiveGamesUseCase.docx
+++ b/Diagrams/FindAllActiveGamesUseCase.docx
@@ -1,6 +1,6 @@
 
 <file path=word/document.xml><?xml version="1.0" encoding="utf-8"?>
-<w:document xmlns:wpc="http://schemas.microsoft.com/office/word/2010/wordprocessingCanvas" xmlns:cx="http://schemas.microsoft.com/office/drawing/2014/chartex" xmlns:cx1="http://schemas.microsoft.com/office/drawing/2015/9/8/chartex" xmlns:cx2="http://schemas.microsoft.com/office/drawing/2015/10/21/chartex" xmlns:cx3="http://schemas.microsoft.com/office/drawing/2016/5/9/chartex" xmlns:cx4="http://schemas.microsoft.com/office/drawing/2016/5/10/chartex" xmlns:cx5="http://schemas.microsoft.com/office/drawing/2016/5/11/chartex" xmlns:mc="http://schemas.openxmlformats.org/markup-compatibility/2006" xmlns:o="urn:schemas-microsoft-com:office:office" xmlns:r="http://schemas.openxmlformats.org/officeDocument/2006/relationships" xmlns:m="http://schemas.openxmlformats.org/officeDocument/2006/math" xmlns:v="urn:schemas-microsoft-com:vml" xmlns:wp14="http://schemas.microsoft.com/office/word/2010/wordprocessingDrawing" xmlns:wp="http://schemas.openxmlformats.org/drawingml/2006/wordprocessingDrawing" xmlns:w10="urn:schemas-microsoft-com:office:word" xmlns:w="http://schemas.openxmlformats.org/wordprocessingml/2006/main" xmlns:w14="http://schemas.microsoft.com/office/word/2010/wordml" xmlns:w15="http://schemas.microsoft.com/office/word/2012/wordml" xmlns:w16se="http://schemas.microsoft.com/office/word/2015/wordml/symex" xmlns:wpg="http://schemas.microsoft.com/office/word/2010/wordprocessingGroup" xmlns:wpi="http://schemas.microsoft.com/office/word/2010/wordprocessingInk" xmlns:wne="http://schemas.microsoft.com/office/word/2006/wordml" xmlns:wps="http://schemas.microsoft.com/office/word/2010/wordprocessingShape" mc:Ignorable="w14 w15 w16se wp14">
+<w:document xmlns:wpc="http://schemas.microsoft.com/office/word/2010/wordprocessingCanvas" xmlns:cx="http://schemas.microsoft.com/office/drawing/2014/chartex" xmlns:cx1="http://schemas.microsoft.com/office/drawing/2015/9/8/chartex" xmlns:cx2="http://schemas.microsoft.com/office/drawing/2015/10/21/chartex" xmlns:cx3="http://schemas.microsoft.com/office/drawing/2016/5/9/chartex" xmlns:cx4="http://schemas.microsoft.com/office/drawing/2016/5/10/chartex" xmlns:cx5="http://schemas.microsoft.com/office/drawing/2016/5/11/chartex" xmlns:cx6="http://schemas.microsoft.com/office/drawing/2016/5/12/chartex" xmlns:cx7="http://schemas.microsoft.com/office/drawing/2016/5/13/chartex" xmlns:cx8="http://schemas.microsoft.com/office/drawing/2016/5/14/chartex" xmlns:mc="http://schemas.openxmlformats.org/markup-compatibility/2006" xmlns:o="urn:schemas-microsoft-com:office:office" xmlns:r="http://schemas.openxmlformats.org/officeDocument/2006/relationships" xmlns:m="http://schemas.openxmlformats.org/officeDocument/2006/math" xmlns:v="urn:schemas-microsoft-com:vml" xmlns:wp14="http://schemas.microsoft.com/office/word/2010/wordprocessingDrawing" xmlns:wp="http://schemas.openxmlformats.org/drawingml/2006/wordprocessingDrawing" xmlns:w10="urn:schemas-microsoft-com:office:word" xmlns:w="http://schemas.openxmlformats.org/wordprocessingml/2006/main" xmlns:w14="http://schemas.microsoft.com/office/word/2010/wordml" xmlns:w15="http://schemas.microsoft.com/office/word/2012/wordml" xmlns:w16se="http://schemas.microsoft.com/office/word/2015/wordml/symex" xmlns:wpg="http://schemas.microsoft.com/office/word/2010/wordprocessingGroup" xmlns:wpi="http://schemas.microsoft.com/office/word/2010/wordprocessingInk" xmlns:wne="http://schemas.microsoft.com/office/word/2006/wordml" xmlns:wps="http://schemas.microsoft.com/office/word/2010/wordprocessingShape" mc:Ignorable="w14 w15 w16se wp14">
   <w:body>
     <w:p>
       <w:pPr>
@@ -23,7 +23,7 @@
     </w:p>
     <w:p>
       <w:pPr>
-        <w:pStyle w:val="a3"/>
+        <w:pStyle w:val="ListParagraph"/>
         <w:numPr>
           <w:ilvl w:val="0"/>
           <w:numId w:val="1"/>
@@ -42,7 +42,7 @@
     </w:p>
     <w:p>
       <w:pPr>
-        <w:pStyle w:val="a3"/>
+        <w:pStyle w:val="ListParagraph"/>
         <w:numPr>
           <w:ilvl w:val="1"/>
           <w:numId w:val="1"/>
@@ -64,7 +64,7 @@
     </w:p>
     <w:p>
       <w:pPr>
-        <w:pStyle w:val="a3"/>
+        <w:pStyle w:val="ListParagraph"/>
         <w:numPr>
           <w:ilvl w:val="0"/>
           <w:numId w:val="1"/>
@@ -83,7 +83,7 @@
     </w:p>
     <w:p>
       <w:pPr>
-        <w:pStyle w:val="a3"/>
+        <w:pStyle w:val="ListParagraph"/>
         <w:numPr>
           <w:ilvl w:val="0"/>
           <w:numId w:val="1"/>
@@ -106,7 +106,7 @@
     </w:p>
     <w:p>
       <w:pPr>
-        <w:pStyle w:val="a3"/>
+        <w:pStyle w:val="ListParagraph"/>
         <w:numPr>
           <w:ilvl w:val="0"/>
           <w:numId w:val="1"/>
@@ -128,7 +128,7 @@
     </w:p>
     <w:p>
       <w:pPr>
-        <w:pStyle w:val="a3"/>
+        <w:pStyle w:val="ListParagraph"/>
         <w:numPr>
           <w:ilvl w:val="0"/>
           <w:numId w:val="1"/>
@@ -147,7 +147,7 @@
     </w:p>
     <w:p>
       <w:pPr>
-        <w:pStyle w:val="a3"/>
+        <w:pStyle w:val="ListParagraph"/>
         <w:numPr>
           <w:ilvl w:val="1"/>
           <w:numId w:val="1"/>
@@ -166,7 +166,7 @@
     </w:p>
     <w:p>
       <w:pPr>
-        <w:pStyle w:val="a3"/>
+        <w:pStyle w:val="ListParagraph"/>
         <w:numPr>
           <w:ilvl w:val="2"/>
           <w:numId w:val="1"/>
@@ -197,7 +197,7 @@
     </w:p>
     <w:p>
       <w:pPr>
-        <w:pStyle w:val="a3"/>
+        <w:pStyle w:val="ListParagraph"/>
         <w:numPr>
           <w:ilvl w:val="2"/>
           <w:numId w:val="1"/>
@@ -213,6 +213,9 @@
         <w:t xml:space="preserve"> join</w:t>
       </w:r>
       <w:r>
+        <w:t xml:space="preserve"> by a search criterion</w:t>
+      </w:r>
+      <w:r>
         <w:t>.</w:t>
       </w:r>
       <w:r>
@@ -221,7 +224,7 @@
     </w:p>
     <w:p>
       <w:pPr>
-        <w:pStyle w:val="a3"/>
+        <w:pStyle w:val="ListParagraph"/>
         <w:numPr>
           <w:ilvl w:val="1"/>
           <w:numId w:val="1"/>
@@ -240,7 +243,7 @@
     </w:p>
     <w:p>
       <w:pPr>
-        <w:pStyle w:val="a3"/>
+        <w:pStyle w:val="ListParagraph"/>
         <w:numPr>
           <w:ilvl w:val="2"/>
           <w:numId w:val="1"/>
@@ -257,26 +260,49 @@
         <w:rPr>
           <w:u w:val="single"/>
         </w:rPr>
-        <w:t>Select a search criterion</w:t>
+        <w:t>Doesn'</w:t>
+      </w:r>
+      <w:r>
+        <w:rPr>
+          <w:u w:val="single"/>
+        </w:rPr>
+        <w:t>t s</w:t>
+      </w:r>
+      <w:r>
+        <w:rPr>
+          <w:u w:val="single"/>
+        </w:rPr>
+        <w:t>elect a search criterion</w:t>
       </w:r>
       <w:r>
         <w:br/>
         <w:t xml:space="preserve">The user </w:t>
       </w:r>
       <w:r>
+        <w:t>doesn't</w:t>
+      </w:r>
+      <w:r>
+        <w:t xml:space="preserve"> </w:t>
+      </w:r>
+      <w:r>
         <w:t>select criterion from criteria list.</w:t>
       </w:r>
       <w:r>
         <w:br/>
-        <w:t xml:space="preserve">In such case the system </w:t>
-      </w:r>
-      <w:r>
-        <w:t>display all active games that the user can join according to the selected criterion.</w:t>
-      </w:r>
-    </w:p>
-    <w:p>
-      <w:pPr>
-        <w:pStyle w:val="a3"/>
+        <w:t>In such</w:t>
+      </w:r>
+      <w:bookmarkStart w:id="0" w:name="_GoBack"/>
+      <w:bookmarkEnd w:id="0"/>
+      <w:r>
+        <w:t xml:space="preserve"> case the system </w:t>
+      </w:r>
+      <w:r>
+        <w:t>display all active games that the user can join.</w:t>
+      </w:r>
+    </w:p>
+    <w:p>
+      <w:pPr>
+        <w:pStyle w:val="ListParagraph"/>
         <w:numPr>
           <w:ilvl w:val="2"/>
           <w:numId w:val="1"/>
@@ -322,7 +348,7 @@
     </w:p>
     <w:p>
       <w:pPr>
-        <w:pStyle w:val="a3"/>
+        <w:pStyle w:val="ListParagraph"/>
         <w:numPr>
           <w:ilvl w:val="2"/>
           <w:numId w:val="1"/>
@@ -378,7 +404,7 @@
     </w:p>
     <w:p>
       <w:pPr>
-        <w:pStyle w:val="a3"/>
+        <w:pStyle w:val="ListParagraph"/>
         <w:numPr>
           <w:ilvl w:val="0"/>
           <w:numId w:val="2"/>
@@ -403,7 +429,7 @@
     </w:p>
     <w:p>
       <w:pPr>
-        <w:pStyle w:val="a3"/>
+        <w:pStyle w:val="ListParagraph"/>
         <w:numPr>
           <w:ilvl w:val="0"/>
           <w:numId w:val="2"/>
@@ -422,7 +448,7 @@
     </w:p>
     <w:p>
       <w:pPr>
-        <w:pStyle w:val="a3"/>
+        <w:pStyle w:val="ListParagraph"/>
         <w:numPr>
           <w:ilvl w:val="1"/>
           <w:numId w:val="2"/>
@@ -440,7 +466,7 @@
     </w:p>
     <w:p>
       <w:pPr>
-        <w:pStyle w:val="a3"/>
+        <w:pStyle w:val="ListParagraph"/>
         <w:numPr>
           <w:ilvl w:val="1"/>
           <w:numId w:val="2"/>
@@ -458,7 +484,7 @@
     </w:p>
     <w:p>
       <w:pPr>
-        <w:pStyle w:val="a3"/>
+        <w:pStyle w:val="ListParagraph"/>
         <w:numPr>
           <w:ilvl w:val="1"/>
           <w:numId w:val="2"/>
@@ -476,7 +502,7 @@
     </w:p>
     <w:p>
       <w:pPr>
-        <w:pStyle w:val="a3"/>
+        <w:pStyle w:val="ListParagraph"/>
         <w:numPr>
           <w:ilvl w:val="0"/>
           <w:numId w:val="2"/>
@@ -495,7 +521,7 @@
     </w:p>
     <w:p>
       <w:pPr>
-        <w:pStyle w:val="a3"/>
+        <w:pStyle w:val="ListParagraph"/>
         <w:numPr>
           <w:ilvl w:val="1"/>
           <w:numId w:val="2"/>
@@ -516,7 +542,7 @@
     </w:p>
     <w:p>
       <w:pPr>
-        <w:pStyle w:val="a3"/>
+        <w:pStyle w:val="ListParagraph"/>
         <w:numPr>
           <w:ilvl w:val="0"/>
           <w:numId w:val="2"/>
@@ -535,36 +561,47 @@
     </w:p>
     <w:p>
       <w:pPr>
-        <w:pStyle w:val="a3"/>
-        <w:ind w:left="360"/>
-      </w:pPr>
-      <w:r>
-        <w:t>4.1  There is no active games to show for the user.</w:t>
-      </w:r>
-      <w:bookmarkStart w:id="0" w:name="_GoBack"/>
-      <w:bookmarkEnd w:id="0"/>
-    </w:p>
-    <w:p/>
-    <w:p/>
-    <w:p/>
-    <w:p/>
-    <w:p/>
-    <w:p/>
-    <w:p/>
-    <w:p/>
-    <w:p/>
-    <w:p>
-      <w:pPr>
-        <w:rPr>
-          <w:b/>
-          <w:bCs/>
-        </w:rPr>
-      </w:pPr>
-      <w:r>
-        <w:rPr>
-          <w:b/>
-          <w:bCs/>
-        </w:rPr>
+        <w:pStyle w:val="ListParagraph"/>
+        <w:numPr>
+          <w:ilvl w:val="1"/>
+          <w:numId w:val="2"/>
+        </w:numPr>
+      </w:pPr>
+      <w:r>
+        <w:t xml:space="preserve"> There</w:t>
+      </w:r>
+      <w:r>
+        <w:t xml:space="preserve"> </w:t>
+      </w:r>
+      <w:r>
+        <w:t>are</w:t>
+      </w:r>
+      <w:r>
+        <w:t xml:space="preserve"> no active games to show for the user.</w:t>
+      </w:r>
+    </w:p>
+    <w:p/>
+    <w:p/>
+    <w:p/>
+    <w:p/>
+    <w:p/>
+    <w:p/>
+    <w:p/>
+    <w:p/>
+    <w:p/>
+    <w:p>
+      <w:pPr>
+        <w:rPr>
+          <w:b/>
+          <w:bCs/>
+        </w:rPr>
+      </w:pPr>
+      <w:r>
+        <w:rPr>
+          <w:b/>
+          <w:bCs/>
+        </w:rPr>
+        <w:lastRenderedPageBreak/>
         <w:t>Use Case Diagram</w:t>
       </w:r>
     </w:p>
@@ -664,21 +701,43 @@
       </w:pPr>
       <w:r>
         <w:rPr>
+          <w:b/>
+          <w:bCs/>
+        </w:rPr>
+        <w:t xml:space="preserve"> </w:t>
+      </w:r>
+      <w:r>
+        <w:rPr>
+          <w:b/>
+          <w:bCs/>
+        </w:rPr>
+        <w:t>Sequence Diagram</w:t>
+      </w:r>
+    </w:p>
+    <w:p>
+      <w:pPr>
+        <w:rPr>
+          <w:b/>
+          <w:bCs/>
+        </w:rPr>
+      </w:pPr>
+      <w:r>
+        <w:rPr>
           <w:noProof/>
         </w:rPr>
         <w:drawing>
           <wp:anchor distT="0" distB="0" distL="114300" distR="114300" simplePos="0" relativeHeight="251660288" behindDoc="1" locked="0" layoutInCell="1" allowOverlap="1">
             <wp:simplePos x="0" y="0"/>
             <wp:positionH relativeFrom="margin">
-              <wp:posOffset>-5963</wp:posOffset>
+              <wp:posOffset>-238125</wp:posOffset>
             </wp:positionH>
             <wp:positionV relativeFrom="paragraph">
-              <wp:posOffset>242791</wp:posOffset>
+              <wp:posOffset>155575</wp:posOffset>
             </wp:positionV>
-            <wp:extent cx="5828854" cy="4595854"/>
-            <wp:effectExtent l="0" t="0" r="635" b="0"/>
+            <wp:extent cx="6267450" cy="4680591"/>
+            <wp:effectExtent l="0" t="0" r="0" b="5715"/>
             <wp:wrapNone/>
-            <wp:docPr id="3" name="Picture 3"/>
+            <wp:docPr id="2" name="Picture 2"/>
             <wp:cNvGraphicFramePr>
               <a:graphicFrameLocks xmlns:a="http://schemas.openxmlformats.org/drawingml/2006/main" noChangeAspect="1"/>
             </wp:cNvGraphicFramePr>
@@ -704,7 +763,7 @@
                   <pic:spPr>
                     <a:xfrm>
                       <a:off x="0" y="0"/>
-                      <a:ext cx="5834151" cy="4600030"/>
+                      <a:ext cx="6267450" cy="4680591"/>
                     </a:xfrm>
                     <a:prstGeom prst="rect">
                       <a:avLst/>
@@ -722,55 +781,41 @@
           </wp:anchor>
         </w:drawing>
       </w:r>
-      <w:r>
-        <w:rPr>
-          <w:b/>
-          <w:bCs/>
-        </w:rPr>
-        <w:t>Sequence Diagram</w:t>
-      </w:r>
-    </w:p>
-    <w:p>
-      <w:pPr>
-        <w:rPr>
-          <w:b/>
-          <w:bCs/>
-        </w:rPr>
-      </w:pPr>
-    </w:p>
-    <w:p>
-      <w:pPr>
-        <w:rPr>
-          <w:b/>
-          <w:bCs/>
-        </w:rPr>
-      </w:pPr>
-    </w:p>
-    <w:p/>
-    <w:p/>
-    <w:p/>
-    <w:p/>
-    <w:p/>
-    <w:p/>
-    <w:p/>
-    <w:p/>
-    <w:p/>
-    <w:p/>
-    <w:p/>
-    <w:p/>
-    <w:p/>
-    <w:p>
-      <w:pPr>
-        <w:rPr>
-          <w:b/>
-          <w:bCs/>
-        </w:rPr>
-      </w:pPr>
-      <w:r>
-        <w:rPr>
-          <w:b/>
-          <w:bCs/>
-        </w:rPr>
+    </w:p>
+    <w:p>
+      <w:pPr>
+        <w:rPr>
+          <w:b/>
+          <w:bCs/>
+        </w:rPr>
+      </w:pPr>
+    </w:p>
+    <w:p/>
+    <w:p/>
+    <w:p/>
+    <w:p/>
+    <w:p/>
+    <w:p/>
+    <w:p/>
+    <w:p/>
+    <w:p/>
+    <w:p/>
+    <w:p/>
+    <w:p/>
+    <w:p/>
+    <w:p>
+      <w:pPr>
+        <w:rPr>
+          <w:b/>
+          <w:bCs/>
+        </w:rPr>
+      </w:pPr>
+      <w:r>
+        <w:rPr>
+          <w:b/>
+          <w:bCs/>
+        </w:rPr>
+        <w:lastRenderedPageBreak/>
         <w:t>Activity Diagram</w:t>
       </w:r>
     </w:p>
@@ -855,7 +900,7 @@
 </file>
 
 <file path=word/numbering.xml><?xml version="1.0" encoding="utf-8"?>
-<w:numbering xmlns:wpc="http://schemas.microsoft.com/office/word/2010/wordprocessingCanvas" xmlns:cx="http://schemas.microsoft.com/office/drawing/2014/chartex" xmlns:cx1="http://schemas.microsoft.com/office/drawing/2015/9/8/chartex" xmlns:cx2="http://schemas.microsoft.com/office/drawing/2015/10/21/chartex" xmlns:cx3="http://schemas.microsoft.com/office/drawing/2016/5/9/chartex" xmlns:cx4="http://schemas.microsoft.com/office/drawing/2016/5/10/chartex" xmlns:cx5="http://schemas.microsoft.com/office/drawing/2016/5/11/chartex" xmlns:mc="http://schemas.openxmlformats.org/markup-compatibility/2006" xmlns:o="urn:schemas-microsoft-com:office:office" xmlns:r="http://schemas.openxmlformats.org/officeDocument/2006/relationships" xmlns:m="http://schemas.openxmlformats.org/officeDocument/2006/math" xmlns:v="urn:schemas-microsoft-com:vml" xmlns:wp14="http://schemas.microsoft.com/office/word/2010/wordprocessingDrawing" xmlns:wp="http://schemas.openxmlformats.org/drawingml/2006/wordprocessingDrawing" xmlns:w10="urn:schemas-microsoft-com:office:word" xmlns:w="http://schemas.openxmlformats.org/wordprocessingml/2006/main" xmlns:w14="http://schemas.microsoft.com/office/word/2010/wordml" xmlns:w15="http://schemas.microsoft.com/office/word/2012/wordml" xmlns:w16se="http://schemas.microsoft.com/office/word/2015/wordml/symex" xmlns:wpg="http://schemas.microsoft.com/office/word/2010/wordprocessingGroup" xmlns:wpi="http://schemas.microsoft.com/office/word/2010/wordprocessingInk" xmlns:wne="http://schemas.microsoft.com/office/word/2006/wordml" xmlns:wps="http://schemas.microsoft.com/office/word/2010/wordprocessingShape" mc:Ignorable="w14 w15 w16se wp14">
+<w:numbering xmlns:wpc="http://schemas.microsoft.com/office/word/2010/wordprocessingCanvas" xmlns:cx="http://schemas.microsoft.com/office/drawing/2014/chartex" xmlns:cx1="http://schemas.microsoft.com/office/drawing/2015/9/8/chartex" xmlns:cx2="http://schemas.microsoft.com/office/drawing/2015/10/21/chartex" xmlns:cx3="http://schemas.microsoft.com/office/drawing/2016/5/9/chartex" xmlns:cx4="http://schemas.microsoft.com/office/drawing/2016/5/10/chartex" xmlns:cx5="http://schemas.microsoft.com/office/drawing/2016/5/11/chartex" xmlns:cx6="http://schemas.microsoft.com/office/drawing/2016/5/12/chartex" xmlns:cx7="http://schemas.microsoft.com/office/drawing/2016/5/13/chartex" xmlns:cx8="http://schemas.microsoft.com/office/drawing/2016/5/14/chartex" xmlns:mc="http://schemas.openxmlformats.org/markup-compatibility/2006" xmlns:o="urn:schemas-microsoft-com:office:office" xmlns:r="http://schemas.openxmlformats.org/officeDocument/2006/relationships" xmlns:m="http://schemas.openxmlformats.org/officeDocument/2006/math" xmlns:v="urn:schemas-microsoft-com:vml" xmlns:wp14="http://schemas.microsoft.com/office/word/2010/wordprocessingDrawing" xmlns:wp="http://schemas.openxmlformats.org/drawingml/2006/wordprocessingDrawing" xmlns:w10="urn:schemas-microsoft-com:office:word" xmlns:w="http://schemas.openxmlformats.org/wordprocessingml/2006/main" xmlns:w14="http://schemas.microsoft.com/office/word/2010/wordml" xmlns:w15="http://schemas.microsoft.com/office/word/2012/wordml" xmlns:w16se="http://schemas.microsoft.com/office/word/2015/wordml/symex" xmlns:wpg="http://schemas.microsoft.com/office/word/2010/wordprocessingGroup" xmlns:wpi="http://schemas.microsoft.com/office/word/2010/wordprocessingInk" xmlns:wne="http://schemas.microsoft.com/office/word/2006/wordml" xmlns:wps="http://schemas.microsoft.com/office/word/2010/wordprocessingShape" mc:Ignorable="w14 w15 w16se wp14">
   <w:abstractNum w:abstractNumId="0" w15:restartNumberingAfterBreak="0">
     <w:nsid w:val="0FD63313"/>
     <w:multiLevelType w:val="multilevel"/>
@@ -1487,18 +1532,18 @@
     <w:lsdException w:name="Smart Hyperlink" w:semiHidden="1" w:unhideWhenUsed="1"/>
     <w:lsdException w:name="Hashtag" w:semiHidden="1" w:unhideWhenUsed="1"/>
   </w:latentStyles>
-  <w:style w:type="paragraph" w:default="1" w:styleId="a">
+  <w:style w:type="paragraph" w:default="1" w:styleId="Normal">
     <w:name w:val="Normal"/>
     <w:qFormat/>
     <w:rsid w:val="002B07A5"/>
   </w:style>
-  <w:style w:type="character" w:default="1" w:styleId="a0">
+  <w:style w:type="character" w:default="1" w:styleId="DefaultParagraphFont">
     <w:name w:val="Default Paragraph Font"/>
     <w:uiPriority w:val="1"/>
     <w:semiHidden/>
     <w:unhideWhenUsed/>
   </w:style>
-  <w:style w:type="table" w:default="1" w:styleId="a1">
+  <w:style w:type="table" w:default="1" w:styleId="TableNormal">
     <w:name w:val="Normal Table"/>
     <w:uiPriority w:val="99"/>
     <w:semiHidden/>
@@ -1513,15 +1558,15 @@
       </w:tblCellMar>
     </w:tblPr>
   </w:style>
-  <w:style w:type="numbering" w:default="1" w:styleId="a2">
+  <w:style w:type="numbering" w:default="1" w:styleId="NoList">
     <w:name w:val="No List"/>
     <w:uiPriority w:val="99"/>
     <w:semiHidden/>
     <w:unhideWhenUsed/>
   </w:style>
-  <w:style w:type="paragraph" w:styleId="a3">
+  <w:style w:type="paragraph" w:styleId="ListParagraph">
     <w:name w:val="List Paragraph"/>
-    <w:basedOn w:val="a"/>
+    <w:basedOn w:val="Normal"/>
     <w:uiPriority w:val="34"/>
     <w:qFormat/>
     <w:rsid w:val="002B07A5"/>

</xml_diff>